<commit_message>
Actualización del informe final (DOCX y PDF)
- Se sincronizan los documentos del informe con los resultados y gráficos actualizados.

- Se consolida la versión de entrega en ambos formatos para mantener consistencia editorial.

- Se incorpora la última revisión documental previa a integración en main.
</commit_message>
<xml_diff>
--- a/documentation/Informe del trabajo.docx
+++ b/documentation/Informe del trabajo.docx
@@ -2064,20 +2064,13 @@
           <w:b/>
           <w:bCs/>
         </w:rPr>
-        <w:instrText xml:space="preserve"> REF _Ref227527258 \h </w:instrText>
-      </w:r>
-      <w:r>
-        <w:rPr>
-          <w:b/>
-          <w:bCs/>
-        </w:rPr>
-      </w:r>
-      <w:r>
-        <w:rPr>
-          <w:b/>
-          <w:bCs/>
-        </w:rPr>
-        <w:instrText xml:space="preserve"> \* MERGEFORMAT </w:instrText>
+        <w:instrText xml:space="preserve"> REF _Ref227527258 \h  \* MERGEFORMAT </w:instrText>
+      </w:r>
+      <w:r>
+        <w:rPr>
+          <w:b/>
+          <w:bCs/>
+        </w:rPr>
       </w:r>
       <w:r>
         <w:rPr>
@@ -2151,12 +2144,6 @@
           <w:b/>
           <w:bCs/>
         </w:rPr>
-      </w:r>
-      <w:r>
-        <w:rPr>
-          <w:b/>
-          <w:bCs/>
-        </w:rPr>
         <w:instrText xml:space="preserve"> \* MERGEFORMAT </w:instrText>
       </w:r>
       <w:r>
@@ -2164,6 +2151,12 @@
           <w:b/>
           <w:bCs/>
         </w:rPr>
+      </w:r>
+      <w:r>
+        <w:rPr>
+          <w:b/>
+          <w:bCs/>
+        </w:rPr>
         <w:fldChar w:fldCharType="separate"/>
       </w:r>
       <w:r>
@@ -2213,12 +2206,6 @@
           <w:b/>
           <w:bCs/>
         </w:rPr>
-      </w:r>
-      <w:r>
-        <w:rPr>
-          <w:b/>
-          <w:bCs/>
-        </w:rPr>
         <w:instrText xml:space="preserve"> \* MERGEFORMAT </w:instrText>
       </w:r>
       <w:r>
@@ -2226,6 +2213,12 @@
           <w:b/>
           <w:bCs/>
         </w:rPr>
+      </w:r>
+      <w:r>
+        <w:rPr>
+          <w:b/>
+          <w:bCs/>
+        </w:rPr>
         <w:fldChar w:fldCharType="separate"/>
       </w:r>
       <w:r>
@@ -2233,7 +2226,23 @@
           <w:b/>
           <w:bCs/>
         </w:rPr>
-        <w:t>Evaluación del solape de IC bootstrap trimestrales (50% y 99%)</w:t>
+        <w:t xml:space="preserve">Evaluación del solape de IC </w:t>
+      </w:r>
+      <w:proofErr w:type="spellStart"/>
+      <w:r>
+        <w:rPr>
+          <w:b/>
+          <w:bCs/>
+        </w:rPr>
+        <w:t>bootstrap</w:t>
+      </w:r>
+      <w:proofErr w:type="spellEnd"/>
+      <w:r>
+        <w:rPr>
+          <w:b/>
+          <w:bCs/>
+        </w:rPr>
+        <w:t xml:space="preserve"> trimestrales (50% y 99%)</w:t>
       </w:r>
       <w:r>
         <w:rPr>
@@ -2297,13 +2306,13 @@
           <w:b/>
           <w:bCs/>
         </w:rPr>
-      </w:r>
-      <w:r>
-        <w:rPr>
-          <w:b/>
-          <w:bCs/>
-        </w:rPr>
         <w:instrText xml:space="preserve"> \* MERGEFORMAT </w:instrText>
+      </w:r>
+      <w:r>
+        <w:rPr>
+          <w:b/>
+          <w:bCs/>
+        </w:rPr>
       </w:r>
       <w:r>
         <w:rPr>
@@ -2375,17 +2384,17 @@
       </w:pPr>
       <w:bookmarkStart w:id="8" w:name="_Toc227430911"/>
       <w:bookmarkStart w:id="9" w:name="_Toc227430928"/>
-      <w:bookmarkStart w:id="10" w:name="_Ref224508194"/>
-      <w:bookmarkStart w:id="11" w:name="_Toc226557328"/>
-      <w:bookmarkStart w:id="12" w:name="_Ref227527204"/>
-      <w:bookmarkStart w:id="13" w:name="_Toc227531633"/>
+      <w:bookmarkStart w:id="10" w:name="_Ref227527204"/>
+      <w:bookmarkStart w:id="11" w:name="_Toc227531633"/>
+      <w:bookmarkStart w:id="12" w:name="_Ref224508194"/>
+      <w:bookmarkStart w:id="13" w:name="_Toc226557328"/>
       <w:r>
         <w:t>Contraste para la afirmación del analista 1 (media superior a 30 °C)</w:t>
       </w:r>
       <w:bookmarkEnd w:id="8"/>
       <w:bookmarkEnd w:id="9"/>
-      <w:bookmarkEnd w:id="12"/>
-      <w:bookmarkEnd w:id="13"/>
+      <w:bookmarkEnd w:id="10"/>
+      <w:bookmarkEnd w:id="11"/>
     </w:p>
     <w:p>
       <w:pPr>
@@ -3139,51 +3148,25 @@
       <w:r>
         <w:t xml:space="preserve">Tabla </w:t>
       </w:r>
-      <w:r>
-        <w:fldChar w:fldCharType="begin"/>
-      </w:r>
-      <w:r>
-        <w:instrText xml:space="preserve"> STYLEREF 1 \s </w:instrText>
-      </w:r>
-      <w:r>
-        <w:fldChar w:fldCharType="separate"/>
-      </w:r>
-      <w:r>
-        <w:rPr>
-          <w:noProof/>
-        </w:rPr>
-        <w:t>1</w:t>
-      </w:r>
-      <w:r>
-        <w:rPr>
-          <w:noProof/>
-        </w:rPr>
-        <w:fldChar w:fldCharType="end"/>
-      </w:r>
+      <w:fldSimple w:instr=" STYLEREF 1 \s ">
+        <w:r>
+          <w:rPr>
+            <w:noProof/>
+          </w:rPr>
+          <w:t>1</w:t>
+        </w:r>
+      </w:fldSimple>
       <w:r>
         <w:t>.</w:t>
       </w:r>
-      <w:r>
-        <w:fldChar w:fldCharType="begin"/>
-      </w:r>
-      <w:r>
-        <w:instrText xml:space="preserve"> SEQ Tabla \* ARABIC \s 1 </w:instrText>
-      </w:r>
-      <w:r>
-        <w:fldChar w:fldCharType="separate"/>
-      </w:r>
-      <w:r>
-        <w:rPr>
-          <w:noProof/>
-        </w:rPr>
-        <w:t>1</w:t>
-      </w:r>
-      <w:r>
-        <w:rPr>
-          <w:noProof/>
-        </w:rPr>
-        <w:fldChar w:fldCharType="end"/>
-      </w:r>
+      <w:fldSimple w:instr=" SEQ Tabla \* ARABIC \s 1 ">
+        <w:r>
+          <w:rPr>
+            <w:noProof/>
+          </w:rPr>
+          <w:t>1</w:t>
+        </w:r>
+      </w:fldSimple>
       <w:r>
         <w:t xml:space="preserve">: </w:t>
       </w:r>
@@ -3409,19 +3392,7 @@
           <w:rPr>
             <w:rFonts w:ascii="Cambria Math" w:hAnsi="Cambria Math"/>
           </w:rPr>
-          <m:t>⇔</m:t>
-        </m:r>
-        <m:r>
-          <w:rPr>
-            <w:rFonts w:ascii="Cambria Math" w:hAnsi="Cambria Math"/>
-          </w:rPr>
-          <m:t>b</m:t>
-        </m:r>
-        <m:r>
-          <w:rPr>
-            <w:rFonts w:ascii="Cambria Math" w:hAnsi="Cambria Math"/>
-          </w:rPr>
-          <m:t>μ&gt;30 °C</m:t>
+          <m:t>⇔bμ&gt;30 °C</m:t>
         </m:r>
       </m:oMath>
     </w:p>
@@ -3615,45 +3586,25 @@
       <w:r>
         <w:t xml:space="preserve">Gráfico </w:t>
       </w:r>
-      <w:r>
-        <w:fldChar w:fldCharType="begin"/>
-      </w:r>
-      <w:r>
-        <w:instrText xml:space="preserve"> STYLEREF 1 \s </w:instrText>
-      </w:r>
-      <w:r>
-        <w:fldChar w:fldCharType="separate"/>
-      </w:r>
-      <w:r>
-        <w:rPr>
-          <w:noProof/>
-        </w:rPr>
-        <w:t>1</w:t>
-      </w:r>
-      <w:r>
-        <w:fldChar w:fldCharType="end"/>
-      </w:r>
+      <w:fldSimple w:instr=" STYLEREF 1 \s ">
+        <w:r>
+          <w:rPr>
+            <w:noProof/>
+          </w:rPr>
+          <w:t>1</w:t>
+        </w:r>
+      </w:fldSimple>
       <w:r>
         <w:t>.</w:t>
       </w:r>
-      <w:r>
-        <w:fldChar w:fldCharType="begin"/>
-      </w:r>
-      <w:r>
-        <w:instrText xml:space="preserve"> SEQ Gráfico \* ARABIC \s 1 </w:instrText>
-      </w:r>
-      <w:r>
-        <w:fldChar w:fldCharType="separate"/>
-      </w:r>
-      <w:r>
-        <w:rPr>
-          <w:noProof/>
-        </w:rPr>
-        <w:t>1</w:t>
-      </w:r>
-      <w:r>
-        <w:fldChar w:fldCharType="end"/>
-      </w:r>
+      <w:fldSimple w:instr=" SEQ Gráfico \* ARABIC \s 1 ">
+        <w:r>
+          <w:rPr>
+            <w:noProof/>
+          </w:rPr>
+          <w:t>1</w:t>
+        </w:r>
+      </w:fldSimple>
       <w:r>
         <w:t xml:space="preserve">: </w:t>
       </w:r>
@@ -3733,13 +3684,7 @@
           <w:rPr>
             <w:rFonts w:ascii="Cambria Math" w:hAnsi="Cambria Math"/>
           </w:rPr>
-          <m:t>μ=</m:t>
-        </m:r>
-        <m:r>
-          <w:rPr>
-            <w:rFonts w:ascii="Cambria Math" w:hAnsi="Cambria Math"/>
-          </w:rPr>
-          <m:t>30 °C</m:t>
+          <m:t>μ=30 °C</m:t>
         </m:r>
       </m:oMath>
       <w:r>
@@ -4687,51 +4632,25 @@
       <w:r>
         <w:t xml:space="preserve">Tabla </w:t>
       </w:r>
-      <w:r>
-        <w:fldChar w:fldCharType="begin"/>
-      </w:r>
-      <w:r>
-        <w:instrText xml:space="preserve"> STYLEREF 1 \s </w:instrText>
-      </w:r>
-      <w:r>
-        <w:fldChar w:fldCharType="separate"/>
-      </w:r>
-      <w:r>
-        <w:rPr>
-          <w:noProof/>
-        </w:rPr>
-        <w:t>1</w:t>
-      </w:r>
-      <w:r>
-        <w:rPr>
-          <w:noProof/>
-        </w:rPr>
-        <w:fldChar w:fldCharType="end"/>
-      </w:r>
+      <w:fldSimple w:instr=" STYLEREF 1 \s ">
+        <w:r>
+          <w:rPr>
+            <w:noProof/>
+          </w:rPr>
+          <w:t>1</w:t>
+        </w:r>
+      </w:fldSimple>
       <w:r>
         <w:t>.</w:t>
       </w:r>
-      <w:r>
-        <w:fldChar w:fldCharType="begin"/>
-      </w:r>
-      <w:r>
-        <w:instrText xml:space="preserve"> SEQ Tabla \* ARABIC \s 1 </w:instrText>
-      </w:r>
-      <w:r>
-        <w:fldChar w:fldCharType="separate"/>
-      </w:r>
-      <w:r>
-        <w:rPr>
-          <w:noProof/>
-        </w:rPr>
-        <w:t>2</w:t>
-      </w:r>
-      <w:r>
-        <w:rPr>
-          <w:noProof/>
-        </w:rPr>
-        <w:fldChar w:fldCharType="end"/>
-      </w:r>
+      <w:fldSimple w:instr=" SEQ Tabla \* ARABIC \s 1 ">
+        <w:r>
+          <w:rPr>
+            <w:noProof/>
+          </w:rPr>
+          <w:t>2</w:t>
+        </w:r>
+      </w:fldSimple>
       <w:r>
         <w:t xml:space="preserve">: </w:t>
       </w:r>
@@ -4885,7 +4804,6 @@
       <w:r>
         <w:t>) permite visualizar la regi</w:t>
       </w:r>
-      <w:proofErr w:type="spellStart"/>
       <w:r>
         <w:rPr>
           <w:rFonts w:cs="Book Antiqua"/>
@@ -4893,11 +4811,7 @@
         <w:t>ó</w:t>
       </w:r>
       <w:r>
-        <w:t>n</w:t>
-      </w:r>
-      <w:proofErr w:type="spellEnd"/>
-      <w:r>
-        <w:t xml:space="preserve"> de rechazo y confirmar que la media muestral se encuentra dentro de la zona cr</w:t>
+        <w:t>n de rechazo y confirmar que la media muestral se encuentra dentro de la zona cr</w:t>
       </w:r>
       <w:r>
         <w:rPr>
@@ -4975,45 +4889,25 @@
       <w:r>
         <w:t xml:space="preserve">Gráfico </w:t>
       </w:r>
-      <w:r>
-        <w:fldChar w:fldCharType="begin"/>
-      </w:r>
-      <w:r>
-        <w:instrText xml:space="preserve"> STYLEREF 1 \s </w:instrText>
-      </w:r>
-      <w:r>
-        <w:fldChar w:fldCharType="separate"/>
-      </w:r>
-      <w:r>
-        <w:rPr>
-          <w:noProof/>
-        </w:rPr>
-        <w:t>1</w:t>
-      </w:r>
-      <w:r>
-        <w:fldChar w:fldCharType="end"/>
-      </w:r>
+      <w:fldSimple w:instr=" STYLEREF 1 \s ">
+        <w:r>
+          <w:rPr>
+            <w:noProof/>
+          </w:rPr>
+          <w:t>1</w:t>
+        </w:r>
+      </w:fldSimple>
       <w:r>
         <w:t>.</w:t>
       </w:r>
-      <w:r>
-        <w:fldChar w:fldCharType="begin"/>
-      </w:r>
-      <w:r>
-        <w:instrText xml:space="preserve"> SEQ Gráfico \* ARABIC \s 1 </w:instrText>
-      </w:r>
-      <w:r>
-        <w:fldChar w:fldCharType="separate"/>
-      </w:r>
-      <w:r>
-        <w:rPr>
-          <w:noProof/>
-        </w:rPr>
-        <w:t>2</w:t>
-      </w:r>
-      <w:r>
-        <w:fldChar w:fldCharType="end"/>
-      </w:r>
+      <w:fldSimple w:instr=" SEQ Gráfico \* ARABIC \s 1 ">
+        <w:r>
+          <w:rPr>
+            <w:noProof/>
+          </w:rPr>
+          <w:t>2</w:t>
+        </w:r>
+      </w:fldSimple>
       <w:r>
         <w:t xml:space="preserve">: </w:t>
       </w:r>
@@ -5209,8 +5103,8 @@
       <w:bookmarkStart w:id="21" w:name="_Ref227528546"/>
       <w:bookmarkStart w:id="22" w:name="_Ref227530444"/>
       <w:bookmarkStart w:id="23" w:name="_Toc227531635"/>
-      <w:bookmarkEnd w:id="10"/>
-      <w:bookmarkEnd w:id="11"/>
+      <w:bookmarkEnd w:id="12"/>
+      <w:bookmarkEnd w:id="13"/>
       <w:r>
         <w:lastRenderedPageBreak/>
         <w:t>Ajuste de distribuciones en la celda 01</w:t>
@@ -5318,45 +5212,25 @@
       <w:r>
         <w:t xml:space="preserve">Gráfico </w:t>
       </w:r>
-      <w:r>
-        <w:fldChar w:fldCharType="begin"/>
-      </w:r>
-      <w:r>
-        <w:instrText xml:space="preserve"> STYLEREF 1 \s </w:instrText>
-      </w:r>
-      <w:r>
-        <w:fldChar w:fldCharType="separate"/>
-      </w:r>
-      <w:r>
-        <w:rPr>
-          <w:noProof/>
-        </w:rPr>
-        <w:t>2</w:t>
-      </w:r>
-      <w:r>
-        <w:fldChar w:fldCharType="end"/>
-      </w:r>
+      <w:fldSimple w:instr=" STYLEREF 1 \s ">
+        <w:r>
+          <w:rPr>
+            <w:noProof/>
+          </w:rPr>
+          <w:t>2</w:t>
+        </w:r>
+      </w:fldSimple>
       <w:r>
         <w:t>.</w:t>
       </w:r>
-      <w:r>
-        <w:fldChar w:fldCharType="begin"/>
-      </w:r>
-      <w:r>
-        <w:instrText xml:space="preserve"> SEQ Gráfico \* ARABIC \s 1 </w:instrText>
-      </w:r>
-      <w:r>
-        <w:fldChar w:fldCharType="separate"/>
-      </w:r>
-      <w:r>
-        <w:rPr>
-          <w:noProof/>
-        </w:rPr>
-        <w:t>1</w:t>
-      </w:r>
-      <w:r>
-        <w:fldChar w:fldCharType="end"/>
-      </w:r>
+      <w:fldSimple w:instr=" SEQ Gráfico \* ARABIC \s 1 ">
+        <w:r>
+          <w:rPr>
+            <w:noProof/>
+          </w:rPr>
+          <w:t>1</w:t>
+        </w:r>
+      </w:fldSimple>
       <w:r>
         <w:t xml:space="preserve">: </w:t>
       </w:r>
@@ -5642,7 +5516,23 @@
           <w:b/>
           <w:bCs/>
         </w:rPr>
-        <w:t>: QQ-Plot de la temperatura en la celda 01 por trimestres</w:t>
+        <w:t>: QQ-</w:t>
+      </w:r>
+      <w:proofErr w:type="spellStart"/>
+      <w:r>
+        <w:rPr>
+          <w:b/>
+          <w:bCs/>
+        </w:rPr>
+        <w:t>Plot</w:t>
+      </w:r>
+      <w:proofErr w:type="spellEnd"/>
+      <w:r>
+        <w:rPr>
+          <w:b/>
+          <w:bCs/>
+        </w:rPr>
+        <w:t xml:space="preserve"> de la temperatura en la celda 01 por trimestres</w:t>
       </w:r>
       <w:r>
         <w:rPr>
@@ -5753,45 +5643,25 @@
       <w:r>
         <w:t xml:space="preserve">Gráfico </w:t>
       </w:r>
-      <w:r>
-        <w:fldChar w:fldCharType="begin"/>
-      </w:r>
-      <w:r>
-        <w:instrText xml:space="preserve"> STYLEREF 1 \s </w:instrText>
-      </w:r>
-      <w:r>
-        <w:fldChar w:fldCharType="separate"/>
-      </w:r>
-      <w:r>
-        <w:rPr>
-          <w:noProof/>
-        </w:rPr>
-        <w:t>2</w:t>
-      </w:r>
-      <w:r>
-        <w:fldChar w:fldCharType="end"/>
-      </w:r>
+      <w:fldSimple w:instr=" STYLEREF 1 \s ">
+        <w:r>
+          <w:rPr>
+            <w:noProof/>
+          </w:rPr>
+          <w:t>2</w:t>
+        </w:r>
+      </w:fldSimple>
       <w:r>
         <w:t>.</w:t>
       </w:r>
-      <w:r>
-        <w:fldChar w:fldCharType="begin"/>
-      </w:r>
-      <w:r>
-        <w:instrText xml:space="preserve"> SEQ Gráfico \* ARABIC \s 1 </w:instrText>
-      </w:r>
-      <w:r>
-        <w:fldChar w:fldCharType="separate"/>
-      </w:r>
-      <w:r>
-        <w:rPr>
-          <w:noProof/>
-        </w:rPr>
-        <w:t>2</w:t>
-      </w:r>
-      <w:r>
-        <w:fldChar w:fldCharType="end"/>
-      </w:r>
+      <w:fldSimple w:instr=" SEQ Gráfico \* ARABIC \s 1 ">
+        <w:r>
+          <w:rPr>
+            <w:noProof/>
+          </w:rPr>
+          <w:t>2</w:t>
+        </w:r>
+      </w:fldSimple>
       <w:r>
         <w:t xml:space="preserve">: </w:t>
       </w:r>
@@ -5966,7 +5836,23 @@
           <w:b/>
           <w:bCs/>
         </w:rPr>
-        <w:t>: QQ-Plot de la irradiación en la celda 01 por trimestres</w:t>
+        <w:t>: QQ-</w:t>
+      </w:r>
+      <w:proofErr w:type="spellStart"/>
+      <w:r>
+        <w:rPr>
+          <w:b/>
+          <w:bCs/>
+        </w:rPr>
+        <w:t>Plot</w:t>
+      </w:r>
+      <w:proofErr w:type="spellEnd"/>
+      <w:r>
+        <w:rPr>
+          <w:b/>
+          <w:bCs/>
+        </w:rPr>
+        <w:t xml:space="preserve"> de la irradiación en la celda 01 por trimestres</w:t>
       </w:r>
       <w:r>
         <w:rPr>
@@ -6070,45 +5956,25 @@
       <w:r>
         <w:t xml:space="preserve">Gráfico </w:t>
       </w:r>
-      <w:r>
-        <w:fldChar w:fldCharType="begin"/>
-      </w:r>
-      <w:r>
-        <w:instrText xml:space="preserve"> STYLEREF 1 \s </w:instrText>
-      </w:r>
-      <w:r>
-        <w:fldChar w:fldCharType="separate"/>
-      </w:r>
-      <w:r>
-        <w:rPr>
-          <w:noProof/>
-        </w:rPr>
-        <w:t>2</w:t>
-      </w:r>
-      <w:r>
-        <w:fldChar w:fldCharType="end"/>
-      </w:r>
+      <w:fldSimple w:instr=" STYLEREF 1 \s ">
+        <w:r>
+          <w:rPr>
+            <w:noProof/>
+          </w:rPr>
+          <w:t>2</w:t>
+        </w:r>
+      </w:fldSimple>
       <w:r>
         <w:t>.</w:t>
       </w:r>
-      <w:r>
-        <w:fldChar w:fldCharType="begin"/>
-      </w:r>
-      <w:r>
-        <w:instrText xml:space="preserve"> SEQ Gráfico \* ARABIC \s 1 </w:instrText>
-      </w:r>
-      <w:r>
-        <w:fldChar w:fldCharType="separate"/>
-      </w:r>
-      <w:r>
-        <w:rPr>
-          <w:noProof/>
-        </w:rPr>
-        <w:t>3</w:t>
-      </w:r>
-      <w:r>
-        <w:fldChar w:fldCharType="end"/>
-      </w:r>
+      <w:fldSimple w:instr=" SEQ Gráfico \* ARABIC \s 1 ">
+        <w:r>
+          <w:rPr>
+            <w:noProof/>
+          </w:rPr>
+          <w:t>3</w:t>
+        </w:r>
+      </w:fldSimple>
       <w:r>
         <w:t xml:space="preserve">: </w:t>
       </w:r>
@@ -6291,45 +6157,25 @@
       <w:r>
         <w:t xml:space="preserve">Gráfico </w:t>
       </w:r>
-      <w:r>
-        <w:fldChar w:fldCharType="begin"/>
-      </w:r>
-      <w:r>
-        <w:instrText xml:space="preserve"> STYLEREF 1 \s </w:instrText>
-      </w:r>
-      <w:r>
-        <w:fldChar w:fldCharType="separate"/>
-      </w:r>
-      <w:r>
-        <w:rPr>
-          <w:noProof/>
-        </w:rPr>
-        <w:t>2</w:t>
-      </w:r>
-      <w:r>
-        <w:fldChar w:fldCharType="end"/>
-      </w:r>
+      <w:fldSimple w:instr=" STYLEREF 1 \s ">
+        <w:r>
+          <w:rPr>
+            <w:noProof/>
+          </w:rPr>
+          <w:t>2</w:t>
+        </w:r>
+      </w:fldSimple>
       <w:r>
         <w:t>.</w:t>
       </w:r>
-      <w:r>
-        <w:fldChar w:fldCharType="begin"/>
-      </w:r>
-      <w:r>
-        <w:instrText xml:space="preserve"> SEQ Gráfico \* ARABIC \s 1 </w:instrText>
-      </w:r>
-      <w:r>
-        <w:fldChar w:fldCharType="separate"/>
-      </w:r>
-      <w:r>
-        <w:rPr>
-          <w:noProof/>
-        </w:rPr>
-        <w:t>4</w:t>
-      </w:r>
-      <w:r>
-        <w:fldChar w:fldCharType="end"/>
-      </w:r>
+      <w:fldSimple w:instr=" SEQ Gráfico \* ARABIC \s 1 ">
+        <w:r>
+          <w:rPr>
+            <w:noProof/>
+          </w:rPr>
+          <w:t>4</w:t>
+        </w:r>
+      </w:fldSimple>
       <w:r>
         <w:t>: Ajuste de distribuciones paramétricas y kernel a la temperatura en la celda 01</w:t>
       </w:r>
@@ -6451,45 +6297,25 @@
       <w:r>
         <w:t xml:space="preserve">Gráfico </w:t>
       </w:r>
-      <w:r>
-        <w:fldChar w:fldCharType="begin"/>
-      </w:r>
-      <w:r>
-        <w:instrText xml:space="preserve"> STYLEREF 1 \s </w:instrText>
-      </w:r>
-      <w:r>
-        <w:fldChar w:fldCharType="separate"/>
-      </w:r>
-      <w:r>
-        <w:rPr>
-          <w:noProof/>
-        </w:rPr>
-        <w:t>2</w:t>
-      </w:r>
-      <w:r>
-        <w:fldChar w:fldCharType="end"/>
-      </w:r>
+      <w:fldSimple w:instr=" STYLEREF 1 \s ">
+        <w:r>
+          <w:rPr>
+            <w:noProof/>
+          </w:rPr>
+          <w:t>2</w:t>
+        </w:r>
+      </w:fldSimple>
       <w:r>
         <w:t>.</w:t>
       </w:r>
-      <w:r>
-        <w:fldChar w:fldCharType="begin"/>
-      </w:r>
-      <w:r>
-        <w:instrText xml:space="preserve"> SEQ Gráfico \* ARABIC \s 1 </w:instrText>
-      </w:r>
-      <w:r>
-        <w:fldChar w:fldCharType="separate"/>
-      </w:r>
-      <w:r>
-        <w:rPr>
-          <w:noProof/>
-        </w:rPr>
-        <w:t>5</w:t>
-      </w:r>
-      <w:r>
-        <w:fldChar w:fldCharType="end"/>
-      </w:r>
+      <w:fldSimple w:instr=" SEQ Gráfico \* ARABIC \s 1 ">
+        <w:r>
+          <w:rPr>
+            <w:noProof/>
+          </w:rPr>
+          <w:t>5</w:t>
+        </w:r>
+      </w:fldSimple>
       <w:r>
         <w:t xml:space="preserve">: </w:t>
       </w:r>
@@ -6605,45 +6431,25 @@
       <w:r>
         <w:t xml:space="preserve">Gráfico </w:t>
       </w:r>
-      <w:r>
-        <w:fldChar w:fldCharType="begin"/>
-      </w:r>
-      <w:r>
-        <w:instrText xml:space="preserve"> STYLEREF 1 \s </w:instrText>
-      </w:r>
-      <w:r>
-        <w:fldChar w:fldCharType="separate"/>
-      </w:r>
-      <w:r>
-        <w:rPr>
-          <w:noProof/>
-        </w:rPr>
-        <w:t>2</w:t>
-      </w:r>
-      <w:r>
-        <w:fldChar w:fldCharType="end"/>
-      </w:r>
+      <w:fldSimple w:instr=" STYLEREF 1 \s ">
+        <w:r>
+          <w:rPr>
+            <w:noProof/>
+          </w:rPr>
+          <w:t>2</w:t>
+        </w:r>
+      </w:fldSimple>
       <w:r>
         <w:t>.</w:t>
       </w:r>
-      <w:r>
-        <w:fldChar w:fldCharType="begin"/>
-      </w:r>
-      <w:r>
-        <w:instrText xml:space="preserve"> SEQ Gráfico \* ARABIC \s 1 </w:instrText>
-      </w:r>
-      <w:r>
-        <w:fldChar w:fldCharType="separate"/>
-      </w:r>
-      <w:r>
-        <w:rPr>
-          <w:noProof/>
-        </w:rPr>
-        <w:t>6</w:t>
-      </w:r>
-      <w:r>
-        <w:fldChar w:fldCharType="end"/>
-      </w:r>
+      <w:fldSimple w:instr=" SEQ Gráfico \* ARABIC \s 1 ">
+        <w:r>
+          <w:rPr>
+            <w:noProof/>
+          </w:rPr>
+          <w:t>6</w:t>
+        </w:r>
+      </w:fldSimple>
       <w:r>
         <w:t xml:space="preserve">: </w:t>
       </w:r>
@@ -6838,45 +6644,25 @@
       <w:r>
         <w:t xml:space="preserve">Gráfico </w:t>
       </w:r>
-      <w:r>
-        <w:fldChar w:fldCharType="begin"/>
-      </w:r>
-      <w:r>
-        <w:instrText xml:space="preserve"> STYLEREF 1 \s </w:instrText>
-      </w:r>
-      <w:r>
-        <w:fldChar w:fldCharType="separate"/>
-      </w:r>
-      <w:r>
-        <w:rPr>
-          <w:noProof/>
-        </w:rPr>
-        <w:t>3</w:t>
-      </w:r>
-      <w:r>
-        <w:fldChar w:fldCharType="end"/>
-      </w:r>
+      <w:fldSimple w:instr=" STYLEREF 1 \s ">
+        <w:r>
+          <w:rPr>
+            <w:noProof/>
+          </w:rPr>
+          <w:t>3</w:t>
+        </w:r>
+      </w:fldSimple>
       <w:r>
         <w:t>.</w:t>
       </w:r>
-      <w:r>
-        <w:fldChar w:fldCharType="begin"/>
-      </w:r>
-      <w:r>
-        <w:instrText xml:space="preserve"> SEQ Gráfico \* ARABIC \s 1 </w:instrText>
-      </w:r>
-      <w:r>
-        <w:fldChar w:fldCharType="separate"/>
-      </w:r>
-      <w:r>
-        <w:rPr>
-          <w:noProof/>
-        </w:rPr>
-        <w:t>1</w:t>
-      </w:r>
-      <w:r>
-        <w:fldChar w:fldCharType="end"/>
-      </w:r>
+      <w:fldSimple w:instr=" SEQ Gráfico \* ARABIC \s 1 ">
+        <w:r>
+          <w:rPr>
+            <w:noProof/>
+          </w:rPr>
+          <w:t>1</w:t>
+        </w:r>
+      </w:fldSimple>
       <w:r>
         <w:t xml:space="preserve">: </w:t>
       </w:r>
@@ -7570,51 +7356,25 @@
       <w:r>
         <w:t xml:space="preserve">Tabla </w:t>
       </w:r>
-      <w:r>
-        <w:fldChar w:fldCharType="begin"/>
-      </w:r>
-      <w:r>
-        <w:instrText xml:space="preserve"> STYLEREF 1 \s </w:instrText>
-      </w:r>
-      <w:r>
-        <w:fldChar w:fldCharType="separate"/>
-      </w:r>
-      <w:r>
-        <w:rPr>
-          <w:noProof/>
-        </w:rPr>
-        <w:t>3</w:t>
-      </w:r>
-      <w:r>
-        <w:rPr>
-          <w:noProof/>
-        </w:rPr>
-        <w:fldChar w:fldCharType="end"/>
-      </w:r>
+      <w:fldSimple w:instr=" STYLEREF 1 \s ">
+        <w:r>
+          <w:rPr>
+            <w:noProof/>
+          </w:rPr>
+          <w:t>3</w:t>
+        </w:r>
+      </w:fldSimple>
       <w:r>
         <w:t>.</w:t>
       </w:r>
-      <w:r>
-        <w:fldChar w:fldCharType="begin"/>
-      </w:r>
-      <w:r>
-        <w:instrText xml:space="preserve"> SEQ Tabla \* ARABIC \s 1 </w:instrText>
-      </w:r>
-      <w:r>
-        <w:fldChar w:fldCharType="separate"/>
-      </w:r>
-      <w:r>
-        <w:rPr>
-          <w:noProof/>
-        </w:rPr>
-        <w:t>1</w:t>
-      </w:r>
-      <w:r>
-        <w:rPr>
-          <w:noProof/>
-        </w:rPr>
-        <w:fldChar w:fldCharType="end"/>
-      </w:r>
+      <w:fldSimple w:instr=" SEQ Tabla \* ARABIC \s 1 ">
+        <w:r>
+          <w:rPr>
+            <w:noProof/>
+          </w:rPr>
+          <w:t>1</w:t>
+        </w:r>
+      </w:fldSimple>
       <w:r>
         <w:t xml:space="preserve">: </w:t>
       </w:r>
@@ -7659,8 +7419,8 @@
         </w:rPr>
         <w:lastRenderedPageBreak/>
         <w:drawing>
-          <wp:inline distT="0" distB="0" distL="0" distR="0" wp14:anchorId="3180D514" wp14:editId="6032353D">
-            <wp:extent cx="4878357" cy="3240000"/>
+          <wp:inline distT="0" distB="0" distL="0" distR="0" wp14:anchorId="3180D514" wp14:editId="541A2718">
+            <wp:extent cx="4878357" cy="3239516"/>
             <wp:effectExtent l="0" t="0" r="0" b="0"/>
             <wp:docPr id="797913946" name="Imagen 9"/>
             <wp:cNvGraphicFramePr>
@@ -7670,7 +7430,7 @@
               <a:graphicData uri="http://schemas.openxmlformats.org/drawingml/2006/picture">
                 <pic:pic xmlns:pic="http://schemas.openxmlformats.org/drawingml/2006/picture">
                   <pic:nvPicPr>
-                    <pic:cNvPr id="0" name="Picture 15"/>
+                    <pic:cNvPr id="797913946" name="Imagen 9"/>
                     <pic:cNvPicPr>
                       <a:picLocks noChangeAspect="1" noChangeArrowheads="1"/>
                     </pic:cNvPicPr>
@@ -7683,7 +7443,6 @@
                         </a:ext>
                       </a:extLst>
                     </a:blip>
-                    <a:srcRect/>
                     <a:stretch>
                       <a:fillRect/>
                     </a:stretch>
@@ -7691,7 +7450,7 @@
                   <pic:spPr bwMode="auto">
                     <a:xfrm>
                       <a:off x="0" y="0"/>
-                      <a:ext cx="4878357" cy="3240000"/>
+                      <a:ext cx="4878357" cy="3239516"/>
                     </a:xfrm>
                     <a:prstGeom prst="rect">
                       <a:avLst/>
@@ -7719,45 +7478,25 @@
       <w:r>
         <w:t xml:space="preserve">Gráfico </w:t>
       </w:r>
-      <w:r>
-        <w:fldChar w:fldCharType="begin"/>
-      </w:r>
-      <w:r>
-        <w:instrText xml:space="preserve"> STYLEREF 1 \s </w:instrText>
-      </w:r>
-      <w:r>
-        <w:fldChar w:fldCharType="separate"/>
-      </w:r>
-      <w:r>
-        <w:rPr>
-          <w:noProof/>
-        </w:rPr>
-        <w:t>3</w:t>
-      </w:r>
-      <w:r>
-        <w:fldChar w:fldCharType="end"/>
-      </w:r>
+      <w:fldSimple w:instr=" STYLEREF 1 \s ">
+        <w:r>
+          <w:rPr>
+            <w:noProof/>
+          </w:rPr>
+          <w:t>3</w:t>
+        </w:r>
+      </w:fldSimple>
       <w:r>
         <w:t>.</w:t>
       </w:r>
-      <w:r>
-        <w:fldChar w:fldCharType="begin"/>
-      </w:r>
-      <w:r>
-        <w:instrText xml:space="preserve"> SEQ Gráfico \* ARABIC \s 1 </w:instrText>
-      </w:r>
-      <w:r>
-        <w:fldChar w:fldCharType="separate"/>
-      </w:r>
-      <w:r>
-        <w:rPr>
-          <w:noProof/>
-        </w:rPr>
-        <w:t>2</w:t>
-      </w:r>
-      <w:r>
-        <w:fldChar w:fldCharType="end"/>
-      </w:r>
+      <w:fldSimple w:instr=" SEQ Gráfico \* ARABIC \s 1 ">
+        <w:r>
+          <w:rPr>
+            <w:noProof/>
+          </w:rPr>
+          <w:t>2</w:t>
+        </w:r>
+      </w:fldSimple>
       <w:r>
         <w:t xml:space="preserve">: </w:t>
       </w:r>
@@ -7821,10 +7560,7 @@
         <w:t>Análisis trimestral de la temperatura mediante intervalos y distribuciones bootstrap</w:t>
       </w:r>
       <w:r>
-        <w:t xml:space="preserve"> </w:t>
-      </w:r>
-      <w:r>
-        <w:t>en la celda 01</w:t>
+        <w:t xml:space="preserve"> en la celda 01</w:t>
       </w:r>
       <w:bookmarkEnd w:id="56"/>
       <w:bookmarkEnd w:id="57"/>
@@ -7887,9 +7623,9 @@
         </w:rPr>
         <w:lastRenderedPageBreak/>
         <w:drawing>
-          <wp:inline distT="0" distB="0" distL="0" distR="0" wp14:anchorId="03D50CEB" wp14:editId="7A711B53">
-            <wp:extent cx="4680000" cy="2324040"/>
-            <wp:effectExtent l="0" t="0" r="6350" b="635"/>
+          <wp:inline distT="0" distB="0" distL="0" distR="0" wp14:anchorId="03D50CEB" wp14:editId="533FDD50">
+            <wp:extent cx="4678211" cy="2324040"/>
+            <wp:effectExtent l="0" t="0" r="8255" b="635"/>
             <wp:docPr id="1161606316" name="Imagen 10"/>
             <wp:cNvGraphicFramePr>
               <a:graphicFrameLocks xmlns:a="http://schemas.openxmlformats.org/drawingml/2006/main" noChangeAspect="1"/>
@@ -7898,7 +7634,7 @@
               <a:graphicData uri="http://schemas.openxmlformats.org/drawingml/2006/picture">
                 <pic:pic xmlns:pic="http://schemas.openxmlformats.org/drawingml/2006/picture">
                   <pic:nvPicPr>
-                    <pic:cNvPr id="0" name="Picture 17"/>
+                    <pic:cNvPr id="1161606316" name="Imagen 10"/>
                     <pic:cNvPicPr>
                       <a:picLocks noChangeAspect="1" noChangeArrowheads="1"/>
                     </pic:cNvPicPr>
@@ -7911,7 +7647,6 @@
                         </a:ext>
                       </a:extLst>
                     </a:blip>
-                    <a:srcRect/>
                     <a:stretch>
                       <a:fillRect/>
                     </a:stretch>
@@ -7919,7 +7654,7 @@
                   <pic:spPr bwMode="auto">
                     <a:xfrm>
                       <a:off x="0" y="0"/>
-                      <a:ext cx="4680000" cy="2324040"/>
+                      <a:ext cx="4678211" cy="2324040"/>
                     </a:xfrm>
                     <a:prstGeom prst="rect">
                       <a:avLst/>
@@ -7943,45 +7678,25 @@
       <w:r>
         <w:t xml:space="preserve">Gráfico </w:t>
       </w:r>
-      <w:r>
-        <w:fldChar w:fldCharType="begin"/>
-      </w:r>
-      <w:r>
-        <w:instrText xml:space="preserve"> STYLEREF 1 \s </w:instrText>
-      </w:r>
-      <w:r>
-        <w:fldChar w:fldCharType="separate"/>
-      </w:r>
-      <w:r>
-        <w:rPr>
-          <w:noProof/>
-        </w:rPr>
-        <w:t>3</w:t>
-      </w:r>
-      <w:r>
-        <w:fldChar w:fldCharType="end"/>
-      </w:r>
+      <w:fldSimple w:instr=" STYLEREF 1 \s ">
+        <w:r>
+          <w:rPr>
+            <w:noProof/>
+          </w:rPr>
+          <w:t>3</w:t>
+        </w:r>
+      </w:fldSimple>
       <w:r>
         <w:t>.</w:t>
       </w:r>
-      <w:r>
-        <w:fldChar w:fldCharType="begin"/>
-      </w:r>
-      <w:r>
-        <w:instrText xml:space="preserve"> SEQ Gráfico \* ARABIC \s 1 </w:instrText>
-      </w:r>
-      <w:r>
-        <w:fldChar w:fldCharType="separate"/>
-      </w:r>
-      <w:r>
-        <w:rPr>
-          <w:noProof/>
-        </w:rPr>
-        <w:t>3</w:t>
-      </w:r>
-      <w:r>
-        <w:fldChar w:fldCharType="end"/>
-      </w:r>
+      <w:fldSimple w:instr=" SEQ Gráfico \* ARABIC \s 1 ">
+        <w:r>
+          <w:rPr>
+            <w:noProof/>
+          </w:rPr>
+          <w:t>3</w:t>
+        </w:r>
+      </w:fldSimple>
       <w:r>
         <w:t xml:space="preserve">: </w:t>
       </w:r>
@@ -8551,51 +8266,25 @@
       <w:r>
         <w:t xml:space="preserve">Tabla </w:t>
       </w:r>
-      <w:r>
-        <w:fldChar w:fldCharType="begin"/>
-      </w:r>
-      <w:r>
-        <w:instrText xml:space="preserve"> STYLEREF 1 \s </w:instrText>
-      </w:r>
-      <w:r>
-        <w:fldChar w:fldCharType="separate"/>
-      </w:r>
-      <w:r>
-        <w:rPr>
-          <w:noProof/>
-        </w:rPr>
-        <w:t>3</w:t>
-      </w:r>
-      <w:r>
-        <w:rPr>
-          <w:noProof/>
-        </w:rPr>
-        <w:fldChar w:fldCharType="end"/>
-      </w:r>
+      <w:fldSimple w:instr=" STYLEREF 1 \s ">
+        <w:r>
+          <w:rPr>
+            <w:noProof/>
+          </w:rPr>
+          <w:t>3</w:t>
+        </w:r>
+      </w:fldSimple>
       <w:r>
         <w:t>.</w:t>
       </w:r>
-      <w:r>
-        <w:fldChar w:fldCharType="begin"/>
-      </w:r>
-      <w:r>
-        <w:instrText xml:space="preserve"> SEQ Tabla \* ARABIC \s 1 </w:instrText>
-      </w:r>
-      <w:r>
-        <w:fldChar w:fldCharType="separate"/>
-      </w:r>
-      <w:r>
-        <w:rPr>
-          <w:noProof/>
-        </w:rPr>
-        <w:t>2</w:t>
-      </w:r>
-      <w:r>
-        <w:rPr>
-          <w:noProof/>
-        </w:rPr>
-        <w:fldChar w:fldCharType="end"/>
-      </w:r>
+      <w:fldSimple w:instr=" SEQ Tabla \* ARABIC \s 1 ">
+        <w:r>
+          <w:rPr>
+            <w:noProof/>
+          </w:rPr>
+          <w:t>2</w:t>
+        </w:r>
+      </w:fldSimple>
       <w:r>
         <w:t>: I</w:t>
       </w:r>
@@ -8639,9 +8328,9 @@
           <w:noProof/>
         </w:rPr>
         <w:drawing>
-          <wp:inline distT="0" distB="0" distL="0" distR="0" wp14:anchorId="269BD453" wp14:editId="5B161D5B">
-            <wp:extent cx="4875767" cy="3240000"/>
-            <wp:effectExtent l="0" t="0" r="1270" b="0"/>
+          <wp:inline distT="0" distB="0" distL="0" distR="0" wp14:anchorId="269BD453" wp14:editId="43C0B72C">
+            <wp:extent cx="4874172" cy="3240000"/>
+            <wp:effectExtent l="0" t="0" r="3175" b="0"/>
             <wp:docPr id="1936235224" name="Imagen 11"/>
             <wp:cNvGraphicFramePr>
               <a:graphicFrameLocks xmlns:a="http://schemas.openxmlformats.org/drawingml/2006/main" noChangeAspect="1"/>
@@ -8650,7 +8339,7 @@
               <a:graphicData uri="http://schemas.openxmlformats.org/drawingml/2006/picture">
                 <pic:pic xmlns:pic="http://schemas.openxmlformats.org/drawingml/2006/picture">
                   <pic:nvPicPr>
-                    <pic:cNvPr id="0" name="Picture 19"/>
+                    <pic:cNvPr id="1936235224" name="Imagen 11"/>
                     <pic:cNvPicPr>
                       <a:picLocks noChangeAspect="1" noChangeArrowheads="1"/>
                     </pic:cNvPicPr>
@@ -8663,7 +8352,6 @@
                         </a:ext>
                       </a:extLst>
                     </a:blip>
-                    <a:srcRect/>
                     <a:stretch>
                       <a:fillRect/>
                     </a:stretch>
@@ -8671,7 +8359,7 @@
                   <pic:spPr bwMode="auto">
                     <a:xfrm>
                       <a:off x="0" y="0"/>
-                      <a:ext cx="4875767" cy="3240000"/>
+                      <a:ext cx="4874172" cy="3240000"/>
                     </a:xfrm>
                     <a:prstGeom prst="rect">
                       <a:avLst/>
@@ -8699,45 +8387,25 @@
       <w:r>
         <w:t xml:space="preserve">Gráfico </w:t>
       </w:r>
-      <w:r>
-        <w:fldChar w:fldCharType="begin"/>
-      </w:r>
-      <w:r>
-        <w:instrText xml:space="preserve"> STYLEREF 1 \s </w:instrText>
-      </w:r>
-      <w:r>
-        <w:fldChar w:fldCharType="separate"/>
-      </w:r>
-      <w:r>
-        <w:rPr>
-          <w:noProof/>
-        </w:rPr>
-        <w:t>3</w:t>
-      </w:r>
-      <w:r>
-        <w:fldChar w:fldCharType="end"/>
-      </w:r>
+      <w:fldSimple w:instr=" STYLEREF 1 \s ">
+        <w:r>
+          <w:rPr>
+            <w:noProof/>
+          </w:rPr>
+          <w:t>3</w:t>
+        </w:r>
+      </w:fldSimple>
       <w:r>
         <w:t>.</w:t>
       </w:r>
-      <w:r>
-        <w:fldChar w:fldCharType="begin"/>
-      </w:r>
-      <w:r>
-        <w:instrText xml:space="preserve"> SEQ Gráfico \* ARABIC \s 1 </w:instrText>
-      </w:r>
-      <w:r>
-        <w:fldChar w:fldCharType="separate"/>
-      </w:r>
-      <w:r>
-        <w:rPr>
-          <w:noProof/>
-        </w:rPr>
-        <w:t>4</w:t>
-      </w:r>
-      <w:r>
-        <w:fldChar w:fldCharType="end"/>
-      </w:r>
+      <w:fldSimple w:instr=" SEQ Gráfico \* ARABIC \s 1 ">
+        <w:r>
+          <w:rPr>
+            <w:noProof/>
+          </w:rPr>
+          <w:t>4</w:t>
+        </w:r>
+      </w:fldSimple>
       <w:r>
         <w:t xml:space="preserve">: </w:t>
       </w:r>
@@ -8866,9 +8534,9 @@
           <w:noProof/>
         </w:rPr>
         <w:drawing>
-          <wp:inline distT="0" distB="0" distL="0" distR="0" wp14:anchorId="33338418" wp14:editId="2CE15211">
-            <wp:extent cx="4680000" cy="2322940"/>
-            <wp:effectExtent l="0" t="0" r="6350" b="1270"/>
+          <wp:inline distT="0" distB="0" distL="0" distR="0" wp14:anchorId="33338418" wp14:editId="5ADBF7DD">
+            <wp:extent cx="4678615" cy="2322940"/>
+            <wp:effectExtent l="0" t="0" r="8255" b="1270"/>
             <wp:docPr id="1070784473" name="Imagen 12"/>
             <wp:cNvGraphicFramePr>
               <a:graphicFrameLocks xmlns:a="http://schemas.openxmlformats.org/drawingml/2006/main" noChangeAspect="1"/>
@@ -8877,7 +8545,7 @@
               <a:graphicData uri="http://schemas.openxmlformats.org/drawingml/2006/picture">
                 <pic:pic xmlns:pic="http://schemas.openxmlformats.org/drawingml/2006/picture">
                   <pic:nvPicPr>
-                    <pic:cNvPr id="0" name="Picture 21"/>
+                    <pic:cNvPr id="1070784473" name="Imagen 12"/>
                     <pic:cNvPicPr>
                       <a:picLocks noChangeAspect="1" noChangeArrowheads="1"/>
                     </pic:cNvPicPr>
@@ -8890,7 +8558,6 @@
                         </a:ext>
                       </a:extLst>
                     </a:blip>
-                    <a:srcRect/>
                     <a:stretch>
                       <a:fillRect/>
                     </a:stretch>
@@ -8898,7 +8565,7 @@
                   <pic:spPr bwMode="auto">
                     <a:xfrm>
                       <a:off x="0" y="0"/>
-                      <a:ext cx="4680000" cy="2322940"/>
+                      <a:ext cx="4678615" cy="2322940"/>
                     </a:xfrm>
                     <a:prstGeom prst="rect">
                       <a:avLst/>
@@ -8922,45 +8589,25 @@
       <w:r>
         <w:t xml:space="preserve">Gráfico </w:t>
       </w:r>
-      <w:r>
-        <w:fldChar w:fldCharType="begin"/>
-      </w:r>
-      <w:r>
-        <w:instrText xml:space="preserve"> STYLEREF 1 \s </w:instrText>
-      </w:r>
-      <w:r>
-        <w:fldChar w:fldCharType="separate"/>
-      </w:r>
-      <w:r>
-        <w:rPr>
-          <w:noProof/>
-        </w:rPr>
-        <w:t>3</w:t>
-      </w:r>
-      <w:r>
-        <w:fldChar w:fldCharType="end"/>
-      </w:r>
+      <w:fldSimple w:instr=" STYLEREF 1 \s ">
+        <w:r>
+          <w:rPr>
+            <w:noProof/>
+          </w:rPr>
+          <w:t>3</w:t>
+        </w:r>
+      </w:fldSimple>
       <w:r>
         <w:t>.</w:t>
       </w:r>
-      <w:r>
-        <w:fldChar w:fldCharType="begin"/>
-      </w:r>
-      <w:r>
-        <w:instrText xml:space="preserve"> SEQ Gráfico \* ARABIC \s 1 </w:instrText>
-      </w:r>
-      <w:r>
-        <w:fldChar w:fldCharType="separate"/>
-      </w:r>
-      <w:r>
-        <w:rPr>
-          <w:noProof/>
-        </w:rPr>
-        <w:t>5</w:t>
-      </w:r>
-      <w:r>
-        <w:fldChar w:fldCharType="end"/>
-      </w:r>
+      <w:fldSimple w:instr=" SEQ Gráfico \* ARABIC \s 1 ">
+        <w:r>
+          <w:rPr>
+            <w:noProof/>
+          </w:rPr>
+          <w:t>5</w:t>
+        </w:r>
+      </w:fldSimple>
       <w:r>
         <w:t xml:space="preserve">: </w:t>
       </w:r>
@@ -10550,51 +10197,25 @@
       <w:r>
         <w:t xml:space="preserve">Tabla </w:t>
       </w:r>
-      <w:r>
-        <w:fldChar w:fldCharType="begin"/>
-      </w:r>
-      <w:r>
-        <w:instrText xml:space="preserve"> STYLEREF 1 \s </w:instrText>
-      </w:r>
-      <w:r>
-        <w:fldChar w:fldCharType="separate"/>
-      </w:r>
-      <w:r>
-        <w:rPr>
-          <w:noProof/>
-        </w:rPr>
-        <w:t>3</w:t>
-      </w:r>
-      <w:r>
-        <w:rPr>
-          <w:noProof/>
-        </w:rPr>
-        <w:fldChar w:fldCharType="end"/>
-      </w:r>
+      <w:fldSimple w:instr=" STYLEREF 1 \s ">
+        <w:r>
+          <w:rPr>
+            <w:noProof/>
+          </w:rPr>
+          <w:t>3</w:t>
+        </w:r>
+      </w:fldSimple>
       <w:r>
         <w:t>.</w:t>
       </w:r>
-      <w:r>
-        <w:fldChar w:fldCharType="begin"/>
-      </w:r>
-      <w:r>
-        <w:instrText xml:space="preserve"> SEQ Tabla \* ARABIC \s 1 </w:instrText>
-      </w:r>
-      <w:r>
-        <w:fldChar w:fldCharType="separate"/>
-      </w:r>
-      <w:r>
-        <w:rPr>
-          <w:noProof/>
-        </w:rPr>
-        <w:t>3</w:t>
-      </w:r>
-      <w:r>
-        <w:rPr>
-          <w:noProof/>
-        </w:rPr>
-        <w:fldChar w:fldCharType="end"/>
-      </w:r>
+      <w:fldSimple w:instr=" SEQ Tabla \* ARABIC \s 1 ">
+        <w:r>
+          <w:rPr>
+            <w:noProof/>
+          </w:rPr>
+          <w:t>3</w:t>
+        </w:r>
+      </w:fldSimple>
       <w:r>
         <w:t xml:space="preserve">: </w:t>
       </w:r>
@@ -10627,9 +10248,9 @@
         </w:rPr>
         <w:lastRenderedPageBreak/>
         <w:drawing>
-          <wp:inline distT="0" distB="0" distL="0" distR="0" wp14:anchorId="37AC6D92" wp14:editId="3A2B5ED1">
-            <wp:extent cx="4680000" cy="3118166"/>
-            <wp:effectExtent l="0" t="0" r="6350" b="6350"/>
+          <wp:inline distT="0" distB="0" distL="0" distR="0" wp14:anchorId="37AC6D92" wp14:editId="171D51E8">
+            <wp:extent cx="4680000" cy="3117551"/>
+            <wp:effectExtent l="0" t="0" r="6350" b="6985"/>
             <wp:docPr id="1226720566" name="Imagen 13"/>
             <wp:cNvGraphicFramePr>
               <a:graphicFrameLocks xmlns:a="http://schemas.openxmlformats.org/drawingml/2006/main" noChangeAspect="1"/>
@@ -10638,7 +10259,7 @@
               <a:graphicData uri="http://schemas.openxmlformats.org/drawingml/2006/picture">
                 <pic:pic xmlns:pic="http://schemas.openxmlformats.org/drawingml/2006/picture">
                   <pic:nvPicPr>
-                    <pic:cNvPr id="0" name="Picture 23"/>
+                    <pic:cNvPr id="1226720566" name="Imagen 13"/>
                     <pic:cNvPicPr>
                       <a:picLocks noChangeAspect="1" noChangeArrowheads="1"/>
                     </pic:cNvPicPr>
@@ -10651,7 +10272,6 @@
                         </a:ext>
                       </a:extLst>
                     </a:blip>
-                    <a:srcRect/>
                     <a:stretch>
                       <a:fillRect/>
                     </a:stretch>
@@ -10659,7 +10279,7 @@
                   <pic:spPr bwMode="auto">
                     <a:xfrm>
                       <a:off x="0" y="0"/>
-                      <a:ext cx="4680000" cy="3118166"/>
+                      <a:ext cx="4680000" cy="3117551"/>
                     </a:xfrm>
                     <a:prstGeom prst="rect">
                       <a:avLst/>
@@ -10683,45 +10303,25 @@
       <w:r>
         <w:t xml:space="preserve">Gráfico </w:t>
       </w:r>
-      <w:r>
-        <w:fldChar w:fldCharType="begin"/>
-      </w:r>
-      <w:r>
-        <w:instrText xml:space="preserve"> STYLEREF 1 \s </w:instrText>
-      </w:r>
-      <w:r>
-        <w:fldChar w:fldCharType="separate"/>
-      </w:r>
-      <w:r>
-        <w:rPr>
-          <w:noProof/>
-        </w:rPr>
-        <w:t>3</w:t>
-      </w:r>
-      <w:r>
-        <w:fldChar w:fldCharType="end"/>
-      </w:r>
+      <w:fldSimple w:instr=" STYLEREF 1 \s ">
+        <w:r>
+          <w:rPr>
+            <w:noProof/>
+          </w:rPr>
+          <w:t>3</w:t>
+        </w:r>
+      </w:fldSimple>
       <w:r>
         <w:t>.</w:t>
       </w:r>
-      <w:r>
-        <w:fldChar w:fldCharType="begin"/>
-      </w:r>
-      <w:r>
-        <w:instrText xml:space="preserve"> SEQ Gráfico \* ARABIC \s 1 </w:instrText>
-      </w:r>
-      <w:r>
-        <w:fldChar w:fldCharType="separate"/>
-      </w:r>
-      <w:r>
-        <w:rPr>
-          <w:noProof/>
-        </w:rPr>
-        <w:t>6</w:t>
-      </w:r>
-      <w:r>
-        <w:fldChar w:fldCharType="end"/>
-      </w:r>
+      <w:fldSimple w:instr=" SEQ Gráfico \* ARABIC \s 1 ">
+        <w:r>
+          <w:rPr>
+            <w:noProof/>
+          </w:rPr>
+          <w:t>6</w:t>
+        </w:r>
+      </w:fldSimple>
       <w:r>
         <w:t xml:space="preserve">: </w:t>
       </w:r>
@@ -11029,45 +10629,25 @@
       <w:r>
         <w:t xml:space="preserve">Gráfico </w:t>
       </w:r>
-      <w:r>
-        <w:fldChar w:fldCharType="begin"/>
-      </w:r>
-      <w:r>
-        <w:instrText xml:space="preserve"> STYLEREF 1 \s </w:instrText>
-      </w:r>
-      <w:r>
-        <w:fldChar w:fldCharType="separate"/>
-      </w:r>
-      <w:r>
-        <w:rPr>
-          <w:noProof/>
-        </w:rPr>
-        <w:t>4</w:t>
-      </w:r>
-      <w:r>
-        <w:fldChar w:fldCharType="end"/>
-      </w:r>
+      <w:fldSimple w:instr=" STYLEREF 1 \s ">
+        <w:r>
+          <w:rPr>
+            <w:noProof/>
+          </w:rPr>
+          <w:t>4</w:t>
+        </w:r>
+      </w:fldSimple>
       <w:r>
         <w:t>.</w:t>
       </w:r>
-      <w:r>
-        <w:fldChar w:fldCharType="begin"/>
-      </w:r>
-      <w:r>
-        <w:instrText xml:space="preserve"> SEQ Gráfico \* ARABIC \s 1 </w:instrText>
-      </w:r>
-      <w:r>
-        <w:fldChar w:fldCharType="separate"/>
-      </w:r>
-      <w:r>
-        <w:rPr>
-          <w:noProof/>
-        </w:rPr>
-        <w:t>1</w:t>
-      </w:r>
-      <w:r>
-        <w:fldChar w:fldCharType="end"/>
-      </w:r>
+      <w:fldSimple w:instr=" SEQ Gráfico \* ARABIC \s 1 ">
+        <w:r>
+          <w:rPr>
+            <w:noProof/>
+          </w:rPr>
+          <w:t>1</w:t>
+        </w:r>
+      </w:fldSimple>
       <w:r>
         <w:t xml:space="preserve">: </w:t>
       </w:r>
@@ -11293,45 +10873,25 @@
       <w:r>
         <w:t xml:space="preserve">Gráfico </w:t>
       </w:r>
-      <w:r>
-        <w:fldChar w:fldCharType="begin"/>
-      </w:r>
-      <w:r>
-        <w:instrText xml:space="preserve"> STYLEREF 1 \s </w:instrText>
-      </w:r>
-      <w:r>
-        <w:fldChar w:fldCharType="separate"/>
-      </w:r>
-      <w:r>
-        <w:rPr>
-          <w:noProof/>
-        </w:rPr>
-        <w:t>4</w:t>
-      </w:r>
-      <w:r>
-        <w:fldChar w:fldCharType="end"/>
-      </w:r>
+      <w:fldSimple w:instr=" STYLEREF 1 \s ">
+        <w:r>
+          <w:rPr>
+            <w:noProof/>
+          </w:rPr>
+          <w:t>4</w:t>
+        </w:r>
+      </w:fldSimple>
       <w:r>
         <w:t>.</w:t>
       </w:r>
-      <w:r>
-        <w:fldChar w:fldCharType="begin"/>
-      </w:r>
-      <w:r>
-        <w:instrText xml:space="preserve"> SEQ Gráfico \* ARABIC \s 1 </w:instrText>
-      </w:r>
-      <w:r>
-        <w:fldChar w:fldCharType="separate"/>
-      </w:r>
-      <w:r>
-        <w:rPr>
-          <w:noProof/>
-        </w:rPr>
-        <w:t>2</w:t>
-      </w:r>
-      <w:r>
-        <w:fldChar w:fldCharType="end"/>
-      </w:r>
+      <w:fldSimple w:instr=" SEQ Gráfico \* ARABIC \s 1 ">
+        <w:r>
+          <w:rPr>
+            <w:noProof/>
+          </w:rPr>
+          <w:t>2</w:t>
+        </w:r>
+      </w:fldSimple>
       <w:r>
         <w:t xml:space="preserve">: </w:t>
       </w:r>
@@ -11606,45 +11166,25 @@
       <w:r>
         <w:t xml:space="preserve">Gráfico </w:t>
       </w:r>
-      <w:r>
-        <w:fldChar w:fldCharType="begin"/>
-      </w:r>
-      <w:r>
-        <w:instrText xml:space="preserve"> STYLEREF 1 \s </w:instrText>
-      </w:r>
-      <w:r>
-        <w:fldChar w:fldCharType="separate"/>
-      </w:r>
-      <w:r>
-        <w:rPr>
-          <w:noProof/>
-        </w:rPr>
-        <w:t>4</w:t>
-      </w:r>
-      <w:r>
-        <w:fldChar w:fldCharType="end"/>
-      </w:r>
+      <w:fldSimple w:instr=" STYLEREF 1 \s ">
+        <w:r>
+          <w:rPr>
+            <w:noProof/>
+          </w:rPr>
+          <w:t>4</w:t>
+        </w:r>
+      </w:fldSimple>
       <w:r>
         <w:t>.</w:t>
       </w:r>
-      <w:r>
-        <w:fldChar w:fldCharType="begin"/>
-      </w:r>
-      <w:r>
-        <w:instrText xml:space="preserve"> SEQ Gráfico \* ARABIC \s 1 </w:instrText>
-      </w:r>
-      <w:r>
-        <w:fldChar w:fldCharType="separate"/>
-      </w:r>
-      <w:r>
-        <w:rPr>
-          <w:noProof/>
-        </w:rPr>
-        <w:t>3</w:t>
-      </w:r>
-      <w:r>
-        <w:fldChar w:fldCharType="end"/>
-      </w:r>
+      <w:fldSimple w:instr=" SEQ Gráfico \* ARABIC \s 1 ">
+        <w:r>
+          <w:rPr>
+            <w:noProof/>
+          </w:rPr>
+          <w:t>3</w:t>
+        </w:r>
+      </w:fldSimple>
       <w:r>
         <w:t xml:space="preserve">: </w:t>
       </w:r>
@@ -11889,13 +11429,13 @@
           <w:b/>
           <w:bCs/>
         </w:rPr>
-      </w:r>
-      <w:r>
-        <w:rPr>
-          <w:b/>
-          <w:bCs/>
-        </w:rPr>
         <w:instrText xml:space="preserve"> \* MERGEFORMAT </w:instrText>
+      </w:r>
+      <w:r>
+        <w:rPr>
+          <w:b/>
+          <w:bCs/>
+        </w:rPr>
       </w:r>
       <w:r>
         <w:rPr>
@@ -11951,12 +11491,6 @@
           <w:b/>
           <w:bCs/>
         </w:rPr>
-      </w:r>
-      <w:r>
-        <w:rPr>
-          <w:b/>
-          <w:bCs/>
-        </w:rPr>
         <w:instrText xml:space="preserve"> \* MERGEFORMAT </w:instrText>
       </w:r>
       <w:r>
@@ -11964,6 +11498,12 @@
           <w:b/>
           <w:bCs/>
         </w:rPr>
+      </w:r>
+      <w:r>
+        <w:rPr>
+          <w:b/>
+          <w:bCs/>
+        </w:rPr>
         <w:fldChar w:fldCharType="separate"/>
       </w:r>
       <w:r>
@@ -12010,12 +11550,6 @@
           <w:b/>
           <w:bCs/>
         </w:rPr>
-      </w:r>
-      <w:r>
-        <w:rPr>
-          <w:b/>
-          <w:bCs/>
-        </w:rPr>
         <w:instrText xml:space="preserve"> \* MERGEFORMAT </w:instrText>
       </w:r>
       <w:r>
@@ -12023,6 +11557,12 @@
           <w:b/>
           <w:bCs/>
         </w:rPr>
+      </w:r>
+      <w:r>
+        <w:rPr>
+          <w:b/>
+          <w:bCs/>
+        </w:rPr>
         <w:fldChar w:fldCharType="separate"/>
       </w:r>
       <w:r>
@@ -12061,12 +11601,6 @@
           <w:b/>
           <w:bCs/>
         </w:rPr>
-      </w:r>
-      <w:r>
-        <w:rPr>
-          <w:b/>
-          <w:bCs/>
-        </w:rPr>
         <w:instrText xml:space="preserve"> \* MERGEFORMAT </w:instrText>
       </w:r>
       <w:r>
@@ -12074,6 +11608,12 @@
           <w:b/>
           <w:bCs/>
         </w:rPr>
+      </w:r>
+      <w:r>
+        <w:rPr>
+          <w:b/>
+          <w:bCs/>
+        </w:rPr>
         <w:fldChar w:fldCharType="separate"/>
       </w:r>
       <w:r>
@@ -12112,12 +11652,6 @@
           <w:b/>
           <w:bCs/>
         </w:rPr>
-      </w:r>
-      <w:r>
-        <w:rPr>
-          <w:b/>
-          <w:bCs/>
-        </w:rPr>
         <w:instrText xml:space="preserve"> \* MERGEFORMAT </w:instrText>
       </w:r>
       <w:r>
@@ -12125,6 +11659,12 @@
           <w:b/>
           <w:bCs/>
         </w:rPr>
+      </w:r>
+      <w:r>
+        <w:rPr>
+          <w:b/>
+          <w:bCs/>
+        </w:rPr>
         <w:fldChar w:fldCharType="separate"/>
       </w:r>
       <w:r>
@@ -12163,12 +11703,6 @@
           <w:b/>
           <w:bCs/>
         </w:rPr>
-      </w:r>
-      <w:r>
-        <w:rPr>
-          <w:b/>
-          <w:bCs/>
-        </w:rPr>
         <w:instrText xml:space="preserve"> \* MERGEFORMAT </w:instrText>
       </w:r>
       <w:r>
@@ -12176,6 +11710,12 @@
           <w:b/>
           <w:bCs/>
         </w:rPr>
+      </w:r>
+      <w:r>
+        <w:rPr>
+          <w:b/>
+          <w:bCs/>
+        </w:rPr>
         <w:fldChar w:fldCharType="separate"/>
       </w:r>
       <w:r>
@@ -12214,12 +11754,6 @@
           <w:b/>
           <w:bCs/>
         </w:rPr>
-      </w:r>
-      <w:r>
-        <w:rPr>
-          <w:b/>
-          <w:bCs/>
-        </w:rPr>
         <w:instrText xml:space="preserve"> \* MERGEFORMAT </w:instrText>
       </w:r>
       <w:r>
@@ -12227,6 +11761,12 @@
           <w:b/>
           <w:bCs/>
         </w:rPr>
+      </w:r>
+      <w:r>
+        <w:rPr>
+          <w:b/>
+          <w:bCs/>
+        </w:rPr>
         <w:fldChar w:fldCharType="separate"/>
       </w:r>
       <w:r>
@@ -12234,7 +11774,23 @@
           <w:b/>
           <w:bCs/>
         </w:rPr>
-        <w:t>Ajuste paramétrico y kernel de la temperatura en la celda 01</w:t>
+        <w:t xml:space="preserve">Ajuste paramétrico y </w:t>
+      </w:r>
+      <w:proofErr w:type="spellStart"/>
+      <w:r>
+        <w:rPr>
+          <w:b/>
+          <w:bCs/>
+        </w:rPr>
+        <w:t>kernel</w:t>
+      </w:r>
+      <w:proofErr w:type="spellEnd"/>
+      <w:r>
+        <w:rPr>
+          <w:b/>
+          <w:bCs/>
+        </w:rPr>
+        <w:t xml:space="preserve"> de la temperatura en la celda 01</w:t>
       </w:r>
       <w:r>
         <w:rPr>
@@ -12265,12 +11821,6 @@
           <w:b/>
           <w:bCs/>
         </w:rPr>
-      </w:r>
-      <w:r>
-        <w:rPr>
-          <w:b/>
-          <w:bCs/>
-        </w:rPr>
         <w:instrText xml:space="preserve"> \* MERGEFORMAT </w:instrText>
       </w:r>
       <w:r>
@@ -12278,6 +11828,12 @@
           <w:b/>
           <w:bCs/>
         </w:rPr>
+      </w:r>
+      <w:r>
+        <w:rPr>
+          <w:b/>
+          <w:bCs/>
+        </w:rPr>
         <w:fldChar w:fldCharType="separate"/>
       </w:r>
       <w:r>
@@ -12285,7 +11841,23 @@
           <w:b/>
           <w:bCs/>
         </w:rPr>
-        <w:t>Ajuste paramétrico y kernel de la irradiación en la celda 01</w:t>
+        <w:t xml:space="preserve">Ajuste paramétrico y </w:t>
+      </w:r>
+      <w:proofErr w:type="spellStart"/>
+      <w:r>
+        <w:rPr>
+          <w:b/>
+          <w:bCs/>
+        </w:rPr>
+        <w:t>kernel</w:t>
+      </w:r>
+      <w:proofErr w:type="spellEnd"/>
+      <w:r>
+        <w:rPr>
+          <w:b/>
+          <w:bCs/>
+        </w:rPr>
+        <w:t xml:space="preserve"> de la irradiación en la celda 01</w:t>
       </w:r>
       <w:r>
         <w:rPr>
@@ -12316,12 +11888,6 @@
           <w:b/>
           <w:bCs/>
         </w:rPr>
-      </w:r>
-      <w:r>
-        <w:rPr>
-          <w:b/>
-          <w:bCs/>
-        </w:rPr>
         <w:instrText xml:space="preserve"> \* MERGEFORMAT </w:instrText>
       </w:r>
       <w:r>
@@ -12329,6 +11895,12 @@
           <w:b/>
           <w:bCs/>
         </w:rPr>
+      </w:r>
+      <w:r>
+        <w:rPr>
+          <w:b/>
+          <w:bCs/>
+        </w:rPr>
         <w:fldChar w:fldCharType="separate"/>
       </w:r>
       <w:r>
@@ -12336,7 +11908,23 @@
           <w:b/>
           <w:bCs/>
         </w:rPr>
-        <w:t>Ajuste paramétrico y kernel de la precipitación en la celda 01</w:t>
+        <w:t xml:space="preserve">Ajuste paramétrico y </w:t>
+      </w:r>
+      <w:proofErr w:type="spellStart"/>
+      <w:r>
+        <w:rPr>
+          <w:b/>
+          <w:bCs/>
+        </w:rPr>
+        <w:t>kernel</w:t>
+      </w:r>
+      <w:proofErr w:type="spellEnd"/>
+      <w:r>
+        <w:rPr>
+          <w:b/>
+          <w:bCs/>
+        </w:rPr>
+        <w:t xml:space="preserve"> de la precipitación en la celda 01</w:t>
       </w:r>
       <w:r>
         <w:rPr>
@@ -12375,12 +11963,6 @@
           <w:b/>
           <w:bCs/>
         </w:rPr>
-      </w:r>
-      <w:r>
-        <w:rPr>
-          <w:b/>
-          <w:bCs/>
-        </w:rPr>
         <w:instrText xml:space="preserve"> \* MERGEFORMAT </w:instrText>
       </w:r>
       <w:r>
@@ -12388,6 +11970,12 @@
           <w:b/>
           <w:bCs/>
         </w:rPr>
+      </w:r>
+      <w:r>
+        <w:rPr>
+          <w:b/>
+          <w:bCs/>
+        </w:rPr>
         <w:fldChar w:fldCharType="separate"/>
       </w:r>
       <w:r>
@@ -12395,7 +11983,23 @@
           <w:b/>
           <w:bCs/>
         </w:rPr>
-        <w:t>Evaluación del solape de IC bootstrap trimestrales (50% y 99%) en la celda 01</w:t>
+        <w:t xml:space="preserve">Evaluación del solape de IC </w:t>
+      </w:r>
+      <w:proofErr w:type="spellStart"/>
+      <w:r>
+        <w:rPr>
+          <w:b/>
+          <w:bCs/>
+        </w:rPr>
+        <w:t>bootstrap</w:t>
+      </w:r>
+      <w:proofErr w:type="spellEnd"/>
+      <w:r>
+        <w:rPr>
+          <w:b/>
+          <w:bCs/>
+        </w:rPr>
+        <w:t xml:space="preserve"> trimestrales (50% y 99%) en la celda 01</w:t>
       </w:r>
       <w:r>
         <w:rPr>
@@ -12426,12 +12030,6 @@
           <w:b/>
           <w:bCs/>
         </w:rPr>
-      </w:r>
-      <w:r>
-        <w:rPr>
-          <w:b/>
-          <w:bCs/>
-        </w:rPr>
         <w:instrText xml:space="preserve"> \* MERGEFORMAT </w:instrText>
       </w:r>
       <w:r>
@@ -12439,6 +12037,12 @@
           <w:b/>
           <w:bCs/>
         </w:rPr>
+      </w:r>
+      <w:r>
+        <w:rPr>
+          <w:b/>
+          <w:bCs/>
+        </w:rPr>
         <w:fldChar w:fldCharType="separate"/>
       </w:r>
       <w:r>
@@ -12446,7 +12050,23 @@
           <w:b/>
           <w:bCs/>
         </w:rPr>
-        <w:t>Análisis trimestral de la irradiación mediante intervalos y distribuciones bootstrap en la celda 01</w:t>
+        <w:t xml:space="preserve">Análisis trimestral de la irradiación mediante intervalos y distribuciones </w:t>
+      </w:r>
+      <w:proofErr w:type="spellStart"/>
+      <w:r>
+        <w:rPr>
+          <w:b/>
+          <w:bCs/>
+        </w:rPr>
+        <w:t>bootstrap</w:t>
+      </w:r>
+      <w:proofErr w:type="spellEnd"/>
+      <w:r>
+        <w:rPr>
+          <w:b/>
+          <w:bCs/>
+        </w:rPr>
+        <w:t xml:space="preserve"> en la celda 01</w:t>
       </w:r>
       <w:r>
         <w:rPr>
@@ -12477,12 +12097,6 @@
           <w:b/>
           <w:bCs/>
         </w:rPr>
-      </w:r>
-      <w:r>
-        <w:rPr>
-          <w:b/>
-          <w:bCs/>
-        </w:rPr>
         <w:instrText xml:space="preserve"> \* MERGEFORMAT </w:instrText>
       </w:r>
       <w:r>
@@ -12490,6 +12104,12 @@
           <w:b/>
           <w:bCs/>
         </w:rPr>
+      </w:r>
+      <w:r>
+        <w:rPr>
+          <w:b/>
+          <w:bCs/>
+        </w:rPr>
         <w:fldChar w:fldCharType="separate"/>
       </w:r>
       <w:r>
@@ -12497,14 +12117,23 @@
           <w:b/>
           <w:bCs/>
         </w:rPr>
-        <w:t xml:space="preserve">Análisis trimestral de la temperatura mediante intervalos y distribuciones bootstrap </w:t>
-      </w:r>
-      <w:r>
-        <w:rPr>
-          <w:b/>
-          <w:bCs/>
-        </w:rPr>
-        <w:t>en la celda 01</w:t>
+        <w:t xml:space="preserve">Análisis trimestral de la temperatura mediante intervalos y distribuciones </w:t>
+      </w:r>
+      <w:proofErr w:type="spellStart"/>
+      <w:r>
+        <w:rPr>
+          <w:b/>
+          <w:bCs/>
+        </w:rPr>
+        <w:t>bootstrap</w:t>
+      </w:r>
+      <w:proofErr w:type="spellEnd"/>
+      <w:r>
+        <w:rPr>
+          <w:b/>
+          <w:bCs/>
+        </w:rPr>
+        <w:t xml:space="preserve"> en la celda 01</w:t>
       </w:r>
       <w:r>
         <w:rPr>
@@ -12535,12 +12164,6 @@
           <w:b/>
           <w:bCs/>
         </w:rPr>
-      </w:r>
-      <w:r>
-        <w:rPr>
-          <w:b/>
-          <w:bCs/>
-        </w:rPr>
         <w:instrText xml:space="preserve"> \* MERGEFORMAT </w:instrText>
       </w:r>
       <w:r>
@@ -12548,6 +12171,12 @@
           <w:b/>
           <w:bCs/>
         </w:rPr>
+      </w:r>
+      <w:r>
+        <w:rPr>
+          <w:b/>
+          <w:bCs/>
+        </w:rPr>
         <w:fldChar w:fldCharType="separate"/>
       </w:r>
       <w:r>
@@ -12555,8 +12184,17 @@
           <w:b/>
           <w:bCs/>
         </w:rPr>
-        <w:t>Análisis trimestral de la precipitación mediante intervalos y distribuciones bootstrap</w:t>
-      </w:r>
+        <w:t xml:space="preserve">Análisis trimestral de la precipitación mediante intervalos y distribuciones </w:t>
+      </w:r>
+      <w:proofErr w:type="spellStart"/>
+      <w:r>
+        <w:rPr>
+          <w:b/>
+          <w:bCs/>
+        </w:rPr>
+        <w:t>bootstrap</w:t>
+      </w:r>
+      <w:proofErr w:type="spellEnd"/>
       <w:r>
         <w:rPr>
           <w:b/>
@@ -12598,13 +12236,13 @@
           <w:b/>
           <w:bCs/>
         </w:rPr>
-      </w:r>
-      <w:r>
-        <w:rPr>
-          <w:b/>
-          <w:bCs/>
-        </w:rPr>
         <w:instrText xml:space="preserve"> \* MERGEFORMAT </w:instrText>
+      </w:r>
+      <w:r>
+        <w:rPr>
+          <w:b/>
+          <w:bCs/>
+        </w:rPr>
       </w:r>
       <w:r>
         <w:rPr>
@@ -12757,6 +12395,7 @@
           <w:bCs/>
           <w:color w:val="000000"/>
         </w:rPr>
+        <w:instrText xml:space="preserve"> \* MERGEFORMAT </w:instrText>
       </w:r>
       <w:r>
         <w:rPr>
@@ -12764,7 +12403,6 @@
           <w:bCs/>
           <w:color w:val="000000"/>
         </w:rPr>
-        <w:instrText xml:space="preserve"> \* MERGEFORMAT </w:instrText>
       </w:r>
       <w:r>
         <w:rPr>
@@ -12830,6 +12468,7 @@
           <w:bCs/>
           <w:color w:val="000000"/>
         </w:rPr>
+        <w:instrText xml:space="preserve"> \* MERGEFORMAT </w:instrText>
       </w:r>
       <w:r>
         <w:rPr>
@@ -12837,7 +12476,6 @@
           <w:bCs/>
           <w:color w:val="000000"/>
         </w:rPr>
-        <w:instrText xml:space="preserve"> \* MERGEFORMAT </w:instrText>
       </w:r>
       <w:r>
         <w:rPr>
@@ -12947,6 +12585,7 @@
           <w:bCs/>
           <w:color w:val="000000"/>
         </w:rPr>
+        <w:instrText xml:space="preserve"> \* MERGEFORMAT </w:instrText>
       </w:r>
       <w:r>
         <w:rPr>
@@ -12954,7 +12593,6 @@
           <w:bCs/>
           <w:color w:val="000000"/>
         </w:rPr>
-        <w:instrText xml:space="preserve"> \* MERGEFORMAT </w:instrText>
       </w:r>
       <w:r>
         <w:rPr>
@@ -13134,6 +12772,7 @@
           <w:bCs/>
           <w:color w:val="000000"/>
         </w:rPr>
+        <w:instrText xml:space="preserve"> \* MERGEFORMAT </w:instrText>
       </w:r>
       <w:r>
         <w:rPr>
@@ -13141,7 +12780,6 @@
           <w:bCs/>
           <w:color w:val="000000"/>
         </w:rPr>
-        <w:instrText xml:space="preserve"> \* MERGEFORMAT </w:instrText>
       </w:r>
       <w:r>
         <w:rPr>
@@ -13156,7 +12794,23 @@
           <w:b/>
           <w:bCs/>
         </w:rPr>
-        <w:t>Evaluación del solape de IC bootstrap trimestrales (50% y 99%)</w:t>
+        <w:t xml:space="preserve">Evaluación del solape de IC </w:t>
+      </w:r>
+      <w:proofErr w:type="spellStart"/>
+      <w:r>
+        <w:rPr>
+          <w:b/>
+          <w:bCs/>
+        </w:rPr>
+        <w:t>bootstrap</w:t>
+      </w:r>
+      <w:proofErr w:type="spellEnd"/>
+      <w:r>
+        <w:rPr>
+          <w:b/>
+          <w:bCs/>
+        </w:rPr>
+        <w:t xml:space="preserve"> trimestrales (50% y 99%)</w:t>
       </w:r>
       <w:r>
         <w:rPr>
@@ -13382,6 +13036,7 @@
           <w:bCs/>
           <w:color w:val="000000"/>
         </w:rPr>
+        <w:instrText xml:space="preserve"> \* MERGEFORMAT </w:instrText>
       </w:r>
       <w:r>
         <w:rPr>
@@ -13389,7 +13044,6 @@
           <w:bCs/>
           <w:color w:val="000000"/>
         </w:rPr>
-        <w:instrText xml:space="preserve"> \* MERGEFORMAT </w:instrText>
       </w:r>
       <w:r>
         <w:rPr>
@@ -13461,19 +13115,7 @@
         <w:rPr>
           <w:szCs w:val="22"/>
         </w:rPr>
-        <w:t>A</w:t>
-      </w:r>
-      <w:r>
-        <w:rPr>
-          <w:szCs w:val="22"/>
-        </w:rPr>
-        <w:t>partado 1.1</w:t>
-      </w:r>
-      <w:r>
-        <w:rPr>
-          <w:szCs w:val="22"/>
-        </w:rPr>
-        <w:t xml:space="preserve"> y 1.2: </w:t>
+        <w:t xml:space="preserve">Apartado 1.1 y 1.2: </w:t>
       </w:r>
       <w:r>
         <w:rPr>
@@ -13613,9 +13255,9 @@
       </w:r>
     </w:p>
     <w:bookmarkEnd w:id="71" w:displacedByCustomXml="next"/>
-    <w:bookmarkStart w:id="72" w:name="_Toc227531652" w:displacedByCustomXml="next"/>
+    <w:bookmarkStart w:id="72" w:name="_Toc226557345" w:displacedByCustomXml="next"/>
     <w:bookmarkStart w:id="73" w:name="_Ref224510253" w:displacedByCustomXml="next"/>
-    <w:bookmarkStart w:id="74" w:name="_Toc226557345" w:displacedByCustomXml="next"/>
+    <w:bookmarkStart w:id="74" w:name="_Toc227531652" w:displacedByCustomXml="next"/>
     <w:sdt>
       <w:sdtPr>
         <w:rPr>
@@ -20464,6 +20106,7 @@
   <w:style w:type="character" w:default="1" w:styleId="Fuentedeprrafopredeter">
     <w:name w:val="Default Paragraph Font"/>
     <w:uiPriority w:val="1"/>
+    <w:semiHidden/>
     <w:unhideWhenUsed/>
   </w:style>
   <w:style w:type="table" w:default="1" w:styleId="Tablanormal">
@@ -21974,11 +21617,30 @@
 </file>
 
 <file path=customXml/item2.xml><?xml version="1.0" encoding="utf-8"?>
-<p:properties xmlns:p="http://schemas.microsoft.com/office/2006/metadata/properties" xmlns:xsi="http://www.w3.org/2001/XMLSchema-instance" xmlns:pc="http://schemas.microsoft.com/office/infopath/2007/PartnerControls">
-  <documentManagement>
-    <_activity xmlns="a4b5ba82-f6b6-4f0d-94e3-c298a78760ad" xsi:nil="true"/>
-  </documentManagement>
-</p:properties>
+<b:Sources xmlns:b="http://schemas.openxmlformats.org/officeDocument/2006/bibliography" xmlns="http://schemas.openxmlformats.org/officeDocument/2006/bibliography" SelectedStyle="\APASixthEditionOfficeOnline.xsl" StyleName="APA" Version="6">
+  <b:Source>
+    <b:Tag>Fel71</b:Tag>
+    <b:SourceType>Book</b:SourceType>
+    <b:Guid>{0ED9F1F1-72EB-436A-B9CE-4828AD9468E7}</b:Guid>
+    <b:Title>An Introduction to Probability Theory and Its Applications</b:Title>
+    <b:Year>1971</b:Year>
+    <b:Publisher>Wiley</b:Publisher>
+    <b:City>New York</b:City>
+    <b:Author>
+      <b:Author>
+        <b:NameList>
+          <b:Person>
+            <b:Last>Feller</b:Last>
+            <b:First>William</b:First>
+          </b:Person>
+        </b:NameList>
+      </b:Author>
+    </b:Author>
+    <b:Volume>2</b:Volume>
+    <b:Edition>2</b:Edition>
+    <b:RefOrder>1</b:RefOrder>
+  </b:Source>
+</b:Sources>
 </file>
 
 <file path=customXml/item3.xml><?xml version="1.0" encoding="utf-8"?>
@@ -22164,30 +21826,11 @@
 </file>
 
 <file path=customXml/item4.xml><?xml version="1.0" encoding="utf-8"?>
-<b:Sources xmlns:b="http://schemas.openxmlformats.org/officeDocument/2006/bibliography" xmlns="http://schemas.openxmlformats.org/officeDocument/2006/bibliography" SelectedStyle="\APASixthEditionOfficeOnline.xsl" StyleName="APA" Version="6">
-  <b:Source>
-    <b:Tag>Fel71</b:Tag>
-    <b:SourceType>Book</b:SourceType>
-    <b:Guid>{0ED9F1F1-72EB-436A-B9CE-4828AD9468E7}</b:Guid>
-    <b:Title>An Introduction to Probability Theory and Its Applications</b:Title>
-    <b:Year>1971</b:Year>
-    <b:Publisher>Wiley</b:Publisher>
-    <b:City>New York</b:City>
-    <b:Author>
-      <b:Author>
-        <b:NameList>
-          <b:Person>
-            <b:Last>Feller</b:Last>
-            <b:First>William</b:First>
-          </b:Person>
-        </b:NameList>
-      </b:Author>
-    </b:Author>
-    <b:Volume>2</b:Volume>
-    <b:Edition>2</b:Edition>
-    <b:RefOrder>1</b:RefOrder>
-  </b:Source>
-</b:Sources>
+<p:properties xmlns:p="http://schemas.microsoft.com/office/2006/metadata/properties" xmlns:xsi="http://www.w3.org/2001/XMLSchema-instance" xmlns:pc="http://schemas.microsoft.com/office/infopath/2007/PartnerControls">
+  <documentManagement>
+    <_activity xmlns="a4b5ba82-f6b6-4f0d-94e3-c298a78760ad" xsi:nil="true"/>
+  </documentManagement>
+</p:properties>
 </file>
 
 <file path=customXml/itemProps1.xml><?xml version="1.0" encoding="utf-8"?>
@@ -22199,11 +21842,9 @@
 </file>
 
 <file path=customXml/itemProps2.xml><?xml version="1.0" encoding="utf-8"?>
-<ds:datastoreItem xmlns:ds="http://schemas.openxmlformats.org/officeDocument/2006/customXml" ds:itemID="{309EE98E-0D28-4A7C-A0A6-C0E416B02BA7}">
+<ds:datastoreItem xmlns:ds="http://schemas.openxmlformats.org/officeDocument/2006/customXml" ds:itemID="{349AA590-BF56-4BB2-9EA4-152EDA7BF95C}">
   <ds:schemaRefs>
-    <ds:schemaRef ds:uri="http://schemas.microsoft.com/office/2006/metadata/properties"/>
-    <ds:schemaRef ds:uri="http://schemas.microsoft.com/office/infopath/2007/PartnerControls"/>
-    <ds:schemaRef ds:uri="a4b5ba82-f6b6-4f0d-94e3-c298a78760ad"/>
+    <ds:schemaRef ds:uri="http://schemas.openxmlformats.org/officeDocument/2006/bibliography"/>
   </ds:schemaRefs>
 </ds:datastoreItem>
 </file>
@@ -22227,9 +21868,11 @@
 </file>
 
 <file path=customXml/itemProps4.xml><?xml version="1.0" encoding="utf-8"?>
-<ds:datastoreItem xmlns:ds="http://schemas.openxmlformats.org/officeDocument/2006/customXml" ds:itemID="{349AA590-BF56-4BB2-9EA4-152EDA7BF95C}">
+<ds:datastoreItem xmlns:ds="http://schemas.openxmlformats.org/officeDocument/2006/customXml" ds:itemID="{309EE98E-0D28-4A7C-A0A6-C0E416B02BA7}">
   <ds:schemaRefs>
-    <ds:schemaRef ds:uri="http://schemas.openxmlformats.org/officeDocument/2006/bibliography"/>
+    <ds:schemaRef ds:uri="http://schemas.microsoft.com/office/2006/metadata/properties"/>
+    <ds:schemaRef ds:uri="http://schemas.microsoft.com/office/infopath/2007/PartnerControls"/>
+    <ds:schemaRef ds:uri="a4b5ba82-f6b6-4f0d-94e3-c298a78760ad"/>
   </ds:schemaRefs>
 </ds:datastoreItem>
 </file>

</xml_diff>